<commit_message>
brewerschoice.net.au — content check 2026-06-30: 26 pages audited, 16 pass, 10 issues (7 H1 mismatches on WooCommerce pages, 8 FAQ/CTA H2 order swaps, 1 missing H2 + duplicate heading on Croydon page)
</commit_message>
<xml_diff>
--- a/clients/energus.com.au/Energus.com.au (Approved).docx
+++ b/clients/energus.com.au/Energus.com.au (Approved).docx
@@ -49520,17 +49520,22 @@
         </w:numPr>
         <w:spacing w:after="0" w:afterAutospacing="0" w:before="0" w:beforeAutospacing="0" w:lineRule="auto"/>
         <w:ind w:left="720" w:hanging="360"/>
-      </w:pPr>
-      <w:r>
-        <w:rPr>
-          <w:b w:val="1"/>
-          <w:bCs w:val="1"/>
+        <w:rPr>
+          <w:color w:val="ff0000"/>
+        </w:rPr>
+      </w:pPr>
+      <w:r>
+        <w:rPr>
+          <w:b w:val="1"/>
+          <w:bCs w:val="1"/>
+          <w:color w:val="ff0000"/>
           <w:rtl w:val="0"/>
         </w:rPr>
         <w:t xml:space="preserve">How does eARC technology work?</w:t>
       </w:r>
       <w:r>
         <w:rPr>
+          <w:color w:val="ff0000"/>
           <w:rtl w:val="0"/>
         </w:rPr>
         <w:t xml:space="preserve"> It replaces heavy glass with a lightweight composite polymer, creating a solar "skin" that is 70% lighter than standard modules.</w:t>
@@ -49544,17 +49549,22 @@
         </w:numPr>
         <w:spacing w:after="0" w:afterAutospacing="0" w:before="0" w:beforeAutospacing="0" w:lineRule="auto"/>
         <w:ind w:left="720" w:hanging="360"/>
-      </w:pPr>
-      <w:r>
-        <w:rPr>
-          <w:b w:val="1"/>
-          <w:bCs w:val="1"/>
+        <w:rPr>
+          <w:color w:val="ff0000"/>
+        </w:rPr>
+      </w:pPr>
+      <w:r>
+        <w:rPr>
+          <w:b w:val="1"/>
+          <w:bCs w:val="1"/>
+          <w:color w:val="ff0000"/>
           <w:rtl w:val="0"/>
         </w:rPr>
         <w:t xml:space="preserve">Can lightweight panels be installed without drilling holes?</w:t>
       </w:r>
       <w:r>
         <w:rPr>
+          <w:color w:val="ff0000"/>
           <w:rtl w:val="0"/>
         </w:rPr>
         <w:t xml:space="preserve"> Yes, eARC panels can be adhesive-bonded directly to the roof surface, maintaining the integrity of waterproof membranes.</w:t>
@@ -49568,17 +49578,22 @@
         </w:numPr>
         <w:spacing w:after="0" w:afterAutospacing="0" w:before="0" w:beforeAutospacing="0" w:lineRule="auto"/>
         <w:ind w:left="720" w:hanging="360"/>
-      </w:pPr>
-      <w:r>
-        <w:rPr>
-          <w:b w:val="1"/>
-          <w:bCs w:val="1"/>
+        <w:rPr>
+          <w:color w:val="ff0000"/>
+        </w:rPr>
+      </w:pPr>
+      <w:r>
+        <w:rPr>
+          <w:b w:val="1"/>
+          <w:bCs w:val="1"/>
+          <w:color w:val="ff0000"/>
           <w:rtl w:val="0"/>
         </w:rPr>
         <w:t xml:space="preserve">Are lightweight solar panels as durable as glass ones?</w:t>
       </w:r>
       <w:r>
         <w:rPr>
+          <w:color w:val="ff0000"/>
           <w:rtl w:val="0"/>
         </w:rPr>
         <w:t xml:space="preserve"> Sunman eARC is the only lightweight technology to pass all the same durability and safety tests as conventional glass panels.</w:t>

</xml_diff>